<commit_message>
Governance doc: add Microsoft Purview section (catalog, labels, DLP, lineage, DQ)
</commit_message>
<xml_diff>
--- a/control_plane/docs/GOVERNANCE_SECURITY.docx
+++ b/control_plane/docs/GOVERNANCE_SECURITY.docx
@@ -1905,13 +1905,7 @@
                 <w:b/>
                 <w:sz w:val="18"/>
               </w:rPr>
-              <w:t>Sensitivity labels</w:t>
-            </w:r>
-            <w:r>
-              <w:rPr>
-                <w:sz w:val="18"/>
-              </w:rPr>
-              <w:t xml:space="preserve"> (Purview Information Protection)</w:t>
+              <w:t>Sensitivity labels + Microsoft Purview</w:t>
             </w:r>
           </w:p>
         </w:tc>
@@ -1929,7 +1923,20 @@
               <w:rPr>
                 <w:sz w:val="18"/>
               </w:rPr>
-              <w:t>Classify + optionally encrypt; labels flow downstream to Power BI/exports</w:t>
+              <w:t>Classification, labels, catalog, lineage, DLP, data quality — estate-wide (</w:t>
+            </w:r>
+            <w:r>
+              <w:rPr>
+                <w:b/>
+                <w:sz w:val="18"/>
+              </w:rPr>
+              <w:t>see §5</w:t>
+            </w:r>
+            <w:r>
+              <w:rPr>
+                <w:sz w:val="18"/>
+              </w:rPr>
+              <w:t>)</w:t>
             </w:r>
           </w:p>
         </w:tc>
@@ -1947,7 +1954,7 @@
               <w:rPr>
                 <w:sz w:val="18"/>
               </w:rPr>
-              <w:t>classification/DLP</w:t>
+              <w:t>governance / compliance plane</w:t>
             </w:r>
           </w:p>
         </w:tc>
@@ -1966,81 +1973,6 @@
                 <w:sz w:val="18"/>
               </w:rPr>
               <w:t>◻ available (not yet wired)</w:t>
-            </w:r>
-          </w:p>
-        </w:tc>
-      </w:tr>
-      <w:tr>
-        <w:tc>
-          <w:tcPr>
-            <w:tcW w:type="dxa" w:w="2160"/>
-          </w:tcPr>
-          <w:p>
-            <w:r>
-              <w:rPr>
-                <w:sz w:val="18"/>
-              </w:rPr>
-            </w:r>
-            <w:r>
-              <w:rPr>
-                <w:b/>
-                <w:sz w:val="18"/>
-              </w:rPr>
-              <w:t>Microsoft Purview</w:t>
-            </w:r>
-          </w:p>
-        </w:tc>
-        <w:tc>
-          <w:tcPr>
-            <w:tcW w:type="dxa" w:w="2160"/>
-          </w:tcPr>
-          <w:p>
-            <w:r>
-              <w:rPr>
-                <w:sz w:val="18"/>
-              </w:rPr>
-            </w:r>
-            <w:r>
-              <w:rPr>
-                <w:sz w:val="18"/>
-              </w:rPr>
-              <w:t>Catalog, lineage, DLP policies, insider-risk, access policies</w:t>
-            </w:r>
-          </w:p>
-        </w:tc>
-        <w:tc>
-          <w:tcPr>
-            <w:tcW w:type="dxa" w:w="2160"/>
-          </w:tcPr>
-          <w:p>
-            <w:r>
-              <w:rPr>
-                <w:sz w:val="18"/>
-              </w:rPr>
-            </w:r>
-            <w:r>
-              <w:rPr>
-                <w:sz w:val="18"/>
-              </w:rPr>
-              <w:t>governance plane</w:t>
-            </w:r>
-          </w:p>
-        </w:tc>
-        <w:tc>
-          <w:tcPr>
-            <w:tcW w:type="dxa" w:w="2160"/>
-          </w:tcPr>
-          <w:p>
-            <w:r>
-              <w:rPr>
-                <w:sz w:val="18"/>
-              </w:rPr>
-            </w:r>
-            <w:r>
-              <w:rPr>
-                <w:sz w:val="18"/>
-              </w:rPr>
-              <w:t>◻ available</w:t>
             </w:r>
           </w:p>
         </w:tc>
@@ -2888,7 +2820,842 @@
       </w:pPr>
       <w:r/>
       <w:r>
-        <w:t>5. Recommended architecture</w:t>
+        <w:t>5. Microsoft Purview — estate-wide governance &amp; compliance</w:t>
+      </w:r>
+    </w:p>
+    <w:p>
+      <w:r>
+        <w:t xml:space="preserve">The Fabric-native controls above (OneLake security, DDM, our </w:t>
+      </w:r>
+      <w:r>
+        <w:rPr>
+          <w:rFonts w:ascii="Consolas" w:hAnsi="Consolas"/>
+          <w:color w:val="A31F34"/>
+        </w:rPr>
+        <w:t>security_policy</w:t>
+      </w:r>
+      <w:r>
+        <w:t>) **enforce access at</w:t>
+      </w:r>
+    </w:p>
+    <w:p>
+      <w:r>
+        <w:t>query time</w:t>
+      </w:r>
+      <w:r>
+        <w:rPr>
+          <w:b/>
+        </w:rPr>
+        <w:t xml:space="preserve">. </w:t>
+      </w:r>
+      <w:r>
+        <w:t>Microsoft Purview</w:t>
+      </w:r>
+      <w:r>
+        <w:rPr>
+          <w:b/>
+        </w:rPr>
+        <w:t xml:space="preserve"> is the complementary </w:t>
+      </w:r>
+      <w:r>
+        <w:t>governance &amp; compliance plane across the</w:t>
+      </w:r>
+    </w:p>
+    <w:p>
+      <w:r>
+        <w:t>whole data estate</w:t>
+      </w:r>
+      <w:r>
+        <w:rPr>
+          <w:b/>
+        </w:rPr>
+        <w:t xml:space="preserve"> (Fabric, Azure, on-prem, multi-cloud) — it </w:t>
+      </w:r>
+      <w:r>
+        <w:t>discovers, classifies, labels, and</w:t>
+      </w:r>
+    </w:p>
+    <w:p>
+      <w:r>
+        <w:t>monitors** data, and tells you *what* is sensitive so the enforcement layers can protect it. It</w:t>
+      </w:r>
+    </w:p>
+    <w:p>
+      <w:r>
+        <w:t xml:space="preserve">integrates </w:t>
+      </w:r>
+      <w:r>
+        <w:rPr>
+          <w:b/>
+        </w:rPr>
+        <w:t>natively with Fabric</w:t>
+      </w:r>
+      <w:r>
+        <w:t>: sensitivity labels and lineage appear inside Fabric workspaces</w:t>
+      </w:r>
+    </w:p>
+    <w:p>
+      <w:r>
+        <w:t>without leaving to the Purview portal. Available today; not yet wired in this framework.</w:t>
+      </w:r>
+    </w:p>
+    <w:tbl>
+      <w:tblPr>
+        <w:tblStyle w:val="LightGrid-Accent1"/>
+        <w:tblW w:type="auto" w:w="0"/>
+        <w:tblLook w:firstColumn="1" w:firstRow="1" w:lastColumn="0" w:lastRow="0" w:noHBand="0" w:noVBand="1" w:val="04A0"/>
+      </w:tblPr>
+      <w:tblGrid>
+        <w:gridCol w:w="2880"/>
+        <w:gridCol w:w="2880"/>
+        <w:gridCol w:w="2880"/>
+      </w:tblGrid>
+      <w:tr>
+        <w:tc>
+          <w:tcPr>
+            <w:tcW w:type="dxa" w:w="2880"/>
+          </w:tcPr>
+          <w:p>
+            <w:r>
+              <w:rPr>
+                <w:b/>
+                <w:sz w:val="18"/>
+              </w:rPr>
+            </w:r>
+            <w:r>
+              <w:rPr>
+                <w:b/>
+                <w:sz w:val="18"/>
+              </w:rPr>
+              <w:t>Capability</w:t>
+            </w:r>
+          </w:p>
+        </w:tc>
+        <w:tc>
+          <w:tcPr>
+            <w:tcW w:type="dxa" w:w="2880"/>
+          </w:tcPr>
+          <w:p>
+            <w:r>
+              <w:rPr>
+                <w:b/>
+                <w:sz w:val="18"/>
+              </w:rPr>
+            </w:r>
+            <w:r>
+              <w:rPr>
+                <w:b/>
+                <w:sz w:val="18"/>
+              </w:rPr>
+              <w:t>What it does</w:t>
+            </w:r>
+          </w:p>
+        </w:tc>
+        <w:tc>
+          <w:tcPr>
+            <w:tcW w:type="dxa" w:w="2880"/>
+          </w:tcPr>
+          <w:p>
+            <w:r>
+              <w:rPr>
+                <w:b/>
+                <w:sz w:val="18"/>
+              </w:rPr>
+            </w:r>
+            <w:r>
+              <w:rPr>
+                <w:b/>
+                <w:sz w:val="18"/>
+              </w:rPr>
+              <w:t>How it fits our framework</w:t>
+            </w:r>
+          </w:p>
+        </w:tc>
+      </w:tr>
+      <w:tr>
+        <w:tc>
+          <w:tcPr>
+            <w:tcW w:type="dxa" w:w="2880"/>
+          </w:tcPr>
+          <w:p>
+            <w:r>
+              <w:rPr>
+                <w:sz w:val="18"/>
+              </w:rPr>
+            </w:r>
+            <w:r>
+              <w:rPr>
+                <w:b/>
+                <w:sz w:val="18"/>
+              </w:rPr>
+              <w:t>Unified Catalog / Data Map</w:t>
+            </w:r>
+          </w:p>
+        </w:tc>
+        <w:tc>
+          <w:tcPr>
+            <w:tcW w:type="dxa" w:w="2880"/>
+          </w:tcPr>
+          <w:p>
+            <w:r>
+              <w:rPr>
+                <w:sz w:val="18"/>
+              </w:rPr>
+            </w:r>
+            <w:r>
+              <w:rPr>
+                <w:sz w:val="18"/>
+              </w:rPr>
+              <w:t xml:space="preserve">Register </w:t>
+            </w:r>
+            <w:r>
+              <w:rPr>
+                <w:b/>
+                <w:sz w:val="18"/>
+              </w:rPr>
+              <w:t>OneLake</w:t>
+            </w:r>
+            <w:r>
+              <w:rPr>
+                <w:sz w:val="18"/>
+              </w:rPr>
+              <w:t>, scan Fabric workspaces, auto-catalog every item; business glossary, tagging, curation/</w:t>
+            </w:r>
+            <w:r>
+              <w:rPr>
+                <w:b/>
+                <w:sz w:val="18"/>
+              </w:rPr>
+              <w:t>certification</w:t>
+            </w:r>
+          </w:p>
+        </w:tc>
+        <w:tc>
+          <w:tcPr>
+            <w:tcW w:type="dxa" w:w="2880"/>
+          </w:tcPr>
+          <w:p>
+            <w:r>
+              <w:rPr>
+                <w:sz w:val="18"/>
+              </w:rPr>
+            </w:r>
+            <w:r>
+              <w:rPr>
+                <w:sz w:val="18"/>
+              </w:rPr>
+              <w:t>A searchable catalog + business context over the tables our pipelines build.</w:t>
+            </w:r>
+          </w:p>
+        </w:tc>
+      </w:tr>
+      <w:tr>
+        <w:tc>
+          <w:tcPr>
+            <w:tcW w:type="dxa" w:w="2880"/>
+          </w:tcPr>
+          <w:p>
+            <w:r>
+              <w:rPr>
+                <w:sz w:val="18"/>
+              </w:rPr>
+            </w:r>
+            <w:r>
+              <w:rPr>
+                <w:b/>
+                <w:sz w:val="18"/>
+              </w:rPr>
+              <w:t>Classification</w:t>
+            </w:r>
+          </w:p>
+        </w:tc>
+        <w:tc>
+          <w:tcPr>
+            <w:tcW w:type="dxa" w:w="2880"/>
+          </w:tcPr>
+          <w:p>
+            <w:r>
+              <w:rPr>
+                <w:sz w:val="18"/>
+              </w:rPr>
+            </w:r>
+            <w:r>
+              <w:rPr>
+                <w:sz w:val="18"/>
+              </w:rPr>
+              <w:t>Auto-detect PII/sensitive columns (built-in + custom classifiers)</w:t>
+            </w:r>
+          </w:p>
+        </w:tc>
+        <w:tc>
+          <w:tcPr>
+            <w:tcW w:type="dxa" w:w="2880"/>
+          </w:tcPr>
+          <w:p>
+            <w:r>
+              <w:rPr>
+                <w:sz w:val="18"/>
+              </w:rPr>
+            </w:r>
+            <w:r>
+              <w:rPr>
+                <w:sz w:val="18"/>
+              </w:rPr>
+              <w:t xml:space="preserve">Surfaces *which columns* need protection → drives the targets in </w:t>
+            </w:r>
+            <w:r>
+              <w:rPr>
+                <w:rFonts w:ascii="Consolas" w:hAnsi="Consolas"/>
+                <w:color w:val="A31F34"/>
+                <w:sz w:val="18"/>
+              </w:rPr>
+              <w:t>security_policy</w:t>
+            </w:r>
+            <w:r>
+              <w:rPr>
+                <w:sz w:val="18"/>
+              </w:rPr>
+              <w:t xml:space="preserve"> (CLS/DDM/</w:t>
+            </w:r>
+            <w:r>
+              <w:rPr>
+                <w:rFonts w:ascii="Consolas" w:hAnsi="Consolas"/>
+                <w:color w:val="A31F34"/>
+                <w:sz w:val="18"/>
+              </w:rPr>
+              <w:t>mask</w:t>
+            </w:r>
+            <w:r>
+              <w:rPr>
+                <w:sz w:val="18"/>
+              </w:rPr>
+              <w:t>).</w:t>
+            </w:r>
+          </w:p>
+        </w:tc>
+      </w:tr>
+      <w:tr>
+        <w:tc>
+          <w:tcPr>
+            <w:tcW w:type="dxa" w:w="2880"/>
+          </w:tcPr>
+          <w:p>
+            <w:r>
+              <w:rPr>
+                <w:sz w:val="18"/>
+              </w:rPr>
+            </w:r>
+            <w:r>
+              <w:rPr>
+                <w:b/>
+                <w:sz w:val="18"/>
+              </w:rPr>
+              <w:t>Sensitivity labels</w:t>
+            </w:r>
+            <w:r>
+              <w:rPr>
+                <w:sz w:val="18"/>
+              </w:rPr>
+              <w:t xml:space="preserve"> (Information Protection / MIP)</w:t>
+            </w:r>
+          </w:p>
+        </w:tc>
+        <w:tc>
+          <w:tcPr>
+            <w:tcW w:type="dxa" w:w="2880"/>
+          </w:tcPr>
+          <w:p>
+            <w:r>
+              <w:rPr>
+                <w:sz w:val="18"/>
+              </w:rPr>
+            </w:r>
+            <w:r>
+              <w:rPr>
+                <w:sz w:val="18"/>
+              </w:rPr>
+              <w:t xml:space="preserve">Label taxonomy (Public → Highly Confidential); </w:t>
+            </w:r>
+            <w:r>
+              <w:rPr>
+                <w:b/>
+                <w:sz w:val="18"/>
+              </w:rPr>
+              <w:t>visible in Fabric</w:t>
+            </w:r>
+            <w:r>
+              <w:rPr>
+                <w:sz w:val="18"/>
+              </w:rPr>
+              <w:t>, flow downstream to Power BI / exports / Office; optional encryption; label-aware Copilot grounding</w:t>
+            </w:r>
+          </w:p>
+        </w:tc>
+        <w:tc>
+          <w:tcPr>
+            <w:tcW w:type="dxa" w:w="2880"/>
+          </w:tcPr>
+          <w:p>
+            <w:r>
+              <w:rPr>
+                <w:sz w:val="18"/>
+              </w:rPr>
+            </w:r>
+            <w:r>
+              <w:rPr>
+                <w:sz w:val="18"/>
+              </w:rPr>
+              <w:t>Classification-driven protection that travels *with the data*, beyond query-time RLS/CLS.</w:t>
+            </w:r>
+          </w:p>
+        </w:tc>
+      </w:tr>
+      <w:tr>
+        <w:tc>
+          <w:tcPr>
+            <w:tcW w:type="dxa" w:w="2880"/>
+          </w:tcPr>
+          <w:p>
+            <w:r>
+              <w:rPr>
+                <w:sz w:val="18"/>
+              </w:rPr>
+            </w:r>
+            <w:r>
+              <w:rPr>
+                <w:b/>
+                <w:sz w:val="18"/>
+              </w:rPr>
+              <w:t>Data Loss Prevention (DLP)</w:t>
+            </w:r>
+          </w:p>
+        </w:tc>
+        <w:tc>
+          <w:tcPr>
+            <w:tcW w:type="dxa" w:w="2880"/>
+          </w:tcPr>
+          <w:p>
+            <w:r>
+              <w:rPr>
+                <w:sz w:val="18"/>
+              </w:rPr>
+            </w:r>
+            <w:r>
+              <w:rPr>
+                <w:sz w:val="18"/>
+              </w:rPr>
+              <w:t xml:space="preserve">Policies detect sensitive data in Fabric (lakehouses, semantic models); </w:t>
+            </w:r>
+            <w:r>
+              <w:rPr>
+                <w:b/>
+                <w:sz w:val="18"/>
+              </w:rPr>
+              <w:t>audit → enforce</w:t>
+            </w:r>
+            <w:r>
+              <w:rPr>
+                <w:sz w:val="18"/>
+              </w:rPr>
+              <w:t xml:space="preserve"> (alert / restrict)</w:t>
+            </w:r>
+          </w:p>
+        </w:tc>
+        <w:tc>
+          <w:tcPr>
+            <w:tcW w:type="dxa" w:w="2880"/>
+          </w:tcPr>
+          <w:p>
+            <w:r>
+              <w:rPr>
+                <w:sz w:val="18"/>
+              </w:rPr>
+            </w:r>
+            <w:r>
+              <w:rPr>
+                <w:sz w:val="18"/>
+              </w:rPr>
+              <w:t>A guardrail on top of least-privilege — catches exposure our roles didn't anticipate.</w:t>
+            </w:r>
+          </w:p>
+        </w:tc>
+      </w:tr>
+      <w:tr>
+        <w:tc>
+          <w:tcPr>
+            <w:tcW w:type="dxa" w:w="2880"/>
+          </w:tcPr>
+          <w:p>
+            <w:r>
+              <w:rPr>
+                <w:sz w:val="18"/>
+              </w:rPr>
+            </w:r>
+            <w:r>
+              <w:rPr>
+                <w:b/>
+                <w:sz w:val="18"/>
+              </w:rPr>
+              <w:t>Data lineage</w:t>
+            </w:r>
+          </w:p>
+        </w:tc>
+        <w:tc>
+          <w:tcPr>
+            <w:tcW w:type="dxa" w:w="2880"/>
+          </w:tcPr>
+          <w:p>
+            <w:r>
+              <w:rPr>
+                <w:sz w:val="18"/>
+              </w:rPr>
+            </w:r>
+            <w:r>
+              <w:rPr>
+                <w:sz w:val="18"/>
+              </w:rPr>
+              <w:t>End-to-end across pipelines, notebooks, and reports — shown in Fabric</w:t>
+            </w:r>
+          </w:p>
+        </w:tc>
+        <w:tc>
+          <w:tcPr>
+            <w:tcW w:type="dxa" w:w="2880"/>
+          </w:tcPr>
+          <w:p>
+            <w:r>
+              <w:rPr>
+                <w:sz w:val="18"/>
+              </w:rPr>
+            </w:r>
+            <w:r>
+              <w:rPr>
+                <w:sz w:val="18"/>
+              </w:rPr>
+              <w:t>Complements our run/object audit tables with visual, cross-item lineage.</w:t>
+            </w:r>
+          </w:p>
+        </w:tc>
+      </w:tr>
+      <w:tr>
+        <w:tc>
+          <w:tcPr>
+            <w:tcW w:type="dxa" w:w="2880"/>
+          </w:tcPr>
+          <w:p>
+            <w:r>
+              <w:rPr>
+                <w:sz w:val="18"/>
+              </w:rPr>
+            </w:r>
+            <w:r>
+              <w:rPr>
+                <w:b/>
+                <w:sz w:val="18"/>
+              </w:rPr>
+              <w:t>Data Quality (DQM)</w:t>
+            </w:r>
+          </w:p>
+        </w:tc>
+        <w:tc>
+          <w:tcPr>
+            <w:tcW w:type="dxa" w:w="2880"/>
+          </w:tcPr>
+          <w:p>
+            <w:r>
+              <w:rPr>
+                <w:sz w:val="18"/>
+              </w:rPr>
+            </w:r>
+            <w:r>
+              <w:rPr>
+                <w:sz w:val="18"/>
+              </w:rPr>
+              <w:t xml:space="preserve">Scan + </w:t>
+            </w:r>
+            <w:r>
+              <w:rPr>
+                <w:b/>
+                <w:sz w:val="18"/>
+              </w:rPr>
+              <w:t>score</w:t>
+            </w:r>
+            <w:r>
+              <w:rPr>
+                <w:sz w:val="18"/>
+              </w:rPr>
+              <w:t xml:space="preserve"> data quality, health controls, rules across the estate</w:t>
+            </w:r>
+          </w:p>
+        </w:tc>
+        <w:tc>
+          <w:tcPr>
+            <w:tcW w:type="dxa" w:w="2880"/>
+          </w:tcPr>
+          <w:p>
+            <w:r>
+              <w:rPr>
+                <w:sz w:val="18"/>
+              </w:rPr>
+            </w:r>
+            <w:r>
+              <w:rPr>
+                <w:sz w:val="18"/>
+              </w:rPr>
+              <w:t xml:space="preserve">Estate-wide quality on top of our per-object </w:t>
+            </w:r>
+            <w:r>
+              <w:rPr>
+                <w:rFonts w:ascii="Consolas" w:hAnsi="Consolas"/>
+                <w:color w:val="A31F34"/>
+                <w:sz w:val="18"/>
+              </w:rPr>
+              <w:t>dq_rule</w:t>
+            </w:r>
+            <w:r>
+              <w:rPr>
+                <w:sz w:val="18"/>
+              </w:rPr>
+              <w:t>/quarantine.</w:t>
+            </w:r>
+          </w:p>
+        </w:tc>
+      </w:tr>
+      <w:tr>
+        <w:tc>
+          <w:tcPr>
+            <w:tcW w:type="dxa" w:w="2880"/>
+          </w:tcPr>
+          <w:p>
+            <w:r>
+              <w:rPr>
+                <w:sz w:val="18"/>
+              </w:rPr>
+            </w:r>
+            <w:r>
+              <w:rPr>
+                <w:b/>
+                <w:sz w:val="18"/>
+              </w:rPr>
+              <w:t>Insider Risk · eDiscovery · Records · Compliance Manager · Audit</w:t>
+            </w:r>
+          </w:p>
+        </w:tc>
+        <w:tc>
+          <w:tcPr>
+            <w:tcW w:type="dxa" w:w="2880"/>
+          </w:tcPr>
+          <w:p>
+            <w:r>
+              <w:rPr>
+                <w:sz w:val="18"/>
+              </w:rPr>
+            </w:r>
+            <w:r>
+              <w:rPr>
+                <w:sz w:val="18"/>
+              </w:rPr>
+              <w:t>Risky-activity detection, legal hold, retention, regulatory posture, unified audit log</w:t>
+            </w:r>
+          </w:p>
+        </w:tc>
+        <w:tc>
+          <w:tcPr>
+            <w:tcW w:type="dxa" w:w="2880"/>
+          </w:tcPr>
+          <w:p>
+            <w:r>
+              <w:rPr>
+                <w:sz w:val="18"/>
+              </w:rPr>
+            </w:r>
+            <w:r>
+              <w:rPr>
+                <w:sz w:val="18"/>
+              </w:rPr>
+              <w:t>The regulatory/compliance suite for a pensions data estate.</w:t>
+            </w:r>
+          </w:p>
+        </w:tc>
+      </w:tr>
+    </w:tbl>
+    <w:p/>
+    <w:p>
+      <w:r>
+        <w:rPr>
+          <w:b/>
+        </w:rPr>
+        <w:t>Recommended rollout (audit-first):</w:t>
+      </w:r>
+    </w:p>
+    <w:p>
+      <w:r>
+        <w:t xml:space="preserve">1. Register </w:t>
+      </w:r>
+      <w:r>
+        <w:rPr>
+          <w:b/>
+        </w:rPr>
+        <w:t>OneLake</w:t>
+      </w:r>
+      <w:r>
+        <w:t xml:space="preserve"> in the Purview </w:t>
+      </w:r>
+      <w:r>
+        <w:rPr>
+          <w:b/>
+        </w:rPr>
+        <w:t>Data Map</w:t>
+      </w:r>
+      <w:r>
+        <w:t>; scan the Fabric workspaces.</w:t>
+      </w:r>
+    </w:p>
+    <w:p>
+      <w:r>
+        <w:t xml:space="preserve">2. Define a </w:t>
+      </w:r>
+      <w:r>
+        <w:rPr>
+          <w:b/>
+        </w:rPr>
+        <w:t>sensitivity-label taxonomy</w:t>
+      </w:r>
+      <w:r>
+        <w:t xml:space="preserve"> and publish it (labels then appear in Fabric).</w:t>
+      </w:r>
+    </w:p>
+    <w:p>
+      <w:r>
+        <w:t xml:space="preserve">3. Run </w:t>
+      </w:r>
+      <w:r>
+        <w:rPr>
+          <w:b/>
+        </w:rPr>
+        <w:t>classification</w:t>
+      </w:r>
+      <w:r>
+        <w:t xml:space="preserve"> to find PII/sensitive columns → feed the targets into our </w:t>
+      </w:r>
+      <w:r>
+        <w:rPr>
+          <w:rFonts w:ascii="Consolas" w:hAnsi="Consolas"/>
+          <w:color w:val="A31F34"/>
+        </w:rPr>
+        <w:t>security_policy</w:t>
+      </w:r>
+      <w:r>
+        <w:t>.</w:t>
+      </w:r>
+    </w:p>
+    <w:p>
+      <w:r>
+        <w:t xml:space="preserve">4. Deploy </w:t>
+      </w:r>
+      <w:r>
+        <w:rPr>
+          <w:b/>
+        </w:rPr>
+        <w:t>DLP</w:t>
+      </w:r>
+      <w:r>
+        <w:t xml:space="preserve"> policies in </w:t>
+      </w:r>
+      <w:r>
+        <w:rPr>
+          <w:b/>
+        </w:rPr>
+        <w:t>audit mode</w:t>
+      </w:r>
+      <w:r>
+        <w:t>, review, then enforce.</w:t>
+      </w:r>
+    </w:p>
+    <w:p>
+      <w:r>
+        <w:t xml:space="preserve">5. Use </w:t>
+      </w:r>
+      <w:r>
+        <w:rPr>
+          <w:b/>
+        </w:rPr>
+        <w:t>catalog + lineage</w:t>
+      </w:r>
+      <w:r>
+        <w:t xml:space="preserve"> for discovery/impact analysis and </w:t>
+      </w:r>
+      <w:r>
+        <w:rPr>
+          <w:b/>
+        </w:rPr>
+        <w:t>DQM</w:t>
+      </w:r>
+      <w:r>
+        <w:t xml:space="preserve"> for estate-wide quality scoring.</w:t>
+      </w:r>
+    </w:p>
+    <w:p>
+      <w:r>
+        <w:rPr>
+          <w:b/>
+        </w:rPr>
+        <w:t>Division of labour:</w:t>
+      </w:r>
+      <w:r>
+        <w:t xml:space="preserve"> *Purview* classifies, labels, catalogs, and monitors (discovery + compliance,</w:t>
+      </w:r>
+    </w:p>
+    <w:p>
+      <w:r>
+        <w:t xml:space="preserve">estate-wide); *OneLake security / Warehouse security / our </w:t>
+      </w:r>
+      <w:r>
+        <w:rPr>
+          <w:rFonts w:ascii="Consolas" w:hAnsi="Consolas"/>
+          <w:color w:val="A31F34"/>
+        </w:rPr>
+        <w:t>security_policy</w:t>
+      </w:r>
+      <w:r>
+        <w:t>* enforce who can read</w:t>
+      </w:r>
+    </w:p>
+    <w:p>
+      <w:r>
+        <w:t xml:space="preserve">what at query time. They compose — Purview says </w:t>
+      </w:r>
+      <w:r>
+        <w:rPr>
+          <w:b/>
+        </w:rPr>
+        <w:t>what is sensitive and labels it</w:t>
+      </w:r>
+      <w:r>
+        <w:t>; the enforcement</w:t>
+      </w:r>
+    </w:p>
+    <w:p>
+      <w:r>
+        <w:t xml:space="preserve">layers decide </w:t>
+      </w:r>
+      <w:r>
+        <w:rPr>
+          <w:b/>
+        </w:rPr>
+        <w:t>who sees it</w:t>
+      </w:r>
+      <w:r>
+        <w:t>.</w:t>
+      </w:r>
+    </w:p>
+    <w:p>
+      <w:pPr>
+        <w:pStyle w:val="Heading2"/>
+      </w:pPr>
+      <w:r/>
+      <w:r>
+        <w:t>6. Recommended architecture</w:t>
       </w:r>
     </w:p>
     <w:p>
@@ -3026,7 +3793,7 @@
       </w:pPr>
       <w:r/>
       <w:r>
-        <w:t>6. Operating notes</w:t>
+        <w:t>7. Operating notes</w:t>
       </w:r>
     </w:p>
     <w:p>
@@ -3252,6 +4019,15 @@
       </w:pPr>
       <w:r>
         <w:t>On-prem connectivity (managed private endpoints): Microsoft Learn — *Connect on-premises data sources using managed private endpoints*.</w:t>
+      </w:r>
+    </w:p>
+    <w:p>
+      <w:pPr>
+        <w:pStyle w:val="ListBullet"/>
+        <w:ind w:left="360"/>
+      </w:pPr>
+      <w:r>
+        <w:t>Microsoft Purview + Fabric (Data Map, sensitivity labels, DLP, lineage, data quality): Microsoft Learn — *Data governance &amp; security baselines with Microsoft Purview*; Microsoft Purview Unified Catalog for Fabric.</w:t>
       </w:r>
     </w:p>
     <w:sectPr>

</xml_diff>

<commit_message>
Governance doc: drop marker emoji; render architecture diagram as image in docx
</commit_message>
<xml_diff>
--- a/control_plane/docs/GOVERNANCE_SECURITY.docx
+++ b/control_plane/docs/GOVERNANCE_SECURITY.docx
@@ -1519,7 +1519,7 @@
               <w:rPr>
                 <w:sz w:val="18"/>
               </w:rPr>
-              <w:t xml:space="preserve">✅ </w:t>
+              <w:t xml:space="preserve">Yes — </w:t>
             </w:r>
             <w:r>
               <w:rPr>
@@ -1609,7 +1609,7 @@
               <w:rPr>
                 <w:sz w:val="18"/>
               </w:rPr>
-              <w:t xml:space="preserve">✅ </w:t>
+              <w:t xml:space="preserve">Yes — </w:t>
             </w:r>
             <w:r>
               <w:rPr>
@@ -1726,7 +1726,7 @@
               <w:rPr>
                 <w:sz w:val="18"/>
               </w:rPr>
-              <w:t xml:space="preserve">✅ </w:t>
+              <w:t xml:space="preserve">Yes — </w:t>
             </w:r>
             <w:r>
               <w:rPr>
@@ -1809,7 +1809,7 @@
               <w:rPr>
                 <w:sz w:val="18"/>
               </w:rPr>
-              <w:t>✅ (SP admin; Viewer for restricted users)</w:t>
+              <w:t>Yes (SP admin; Viewer for restricted users)</w:t>
             </w:r>
           </w:p>
         </w:tc>
@@ -1884,7 +1884,7 @@
               <w:rPr>
                 <w:sz w:val="18"/>
               </w:rPr>
-              <w:t>✅</w:t>
+              <w:t>Yes</w:t>
             </w:r>
           </w:p>
         </w:tc>
@@ -1972,7 +1972,7 @@
               <w:rPr>
                 <w:sz w:val="18"/>
               </w:rPr>
-              <w:t>◻ available (not yet wired)</w:t>
+              <w:t>Available (not yet wired)</w:t>
             </w:r>
           </w:p>
         </w:tc>
@@ -2047,7 +2047,7 @@
               <w:rPr>
                 <w:sz w:val="18"/>
               </w:rPr>
-              <w:t>◻ available (see WORKING_GUIDE §4.11)</w:t>
+              <w:t>Available (see WORKING_GUIDE §4.11)</w:t>
             </w:r>
           </w:p>
         </w:tc>
@@ -3660,26 +3660,41 @@
     </w:p>
     <w:p>
       <w:pPr>
-        <w:ind w:left="240"/>
+        <w:jc w:val="center"/>
       </w:pPr>
       <w:r>
-        <w:rPr>
-          <w:rFonts w:ascii="Consolas" w:hAnsi="Consolas"/>
-          <w:sz w:val="17"/>
-        </w:rPr>
-        <w:t xml:space="preserve">                 ┌─────────────────────────── OneLake security (RLS/CLS) — cross-engine ──────────────┐</w:t>
-        <w:br/>
-        <w:t xml:space="preserve"> sources ──► bronze ──► silver ──► gold        (Spark / SQL endpoint / Direct Lake)                    │</w:t>
-        <w:br/>
-        <w:t xml:space="preserve"> (KV creds)   (schema-enabled lakehouses; DQ, cleanse, mask, quarantine, audit)                        │</w:t>
-        <w:br/>
-        <w:t xml:space="preserve">                                   │                                                                    │</w:t>
-        <w:br/>
-        <w:t xml:space="preserve">                                   └──►  (optional) Fabric WAREHOUSE = serving layer                    │</w:t>
-        <w:br/>
-        <w:t xml:space="preserve">                                         full T-SQL GRANT/DENY, RLS policies, CLS, DDM, curated views ──┘</w:t>
-        <w:br/>
-        <w:t xml:space="preserve">                                         → Power BI / analysts / apps</w:t>
+        <w:drawing>
+          <wp:inline xmlns:a="http://schemas.openxmlformats.org/drawingml/2006/main" xmlns:pic="http://schemas.openxmlformats.org/drawingml/2006/picture">
+            <wp:extent cx="5669280" cy="995257"/>
+            <wp:docPr id="1" name="Picture 1"/>
+            <wp:cNvGraphicFramePr>
+              <a:graphicFrameLocks noChangeAspect="1"/>
+            </wp:cNvGraphicFramePr>
+            <a:graphic>
+              <a:graphicData uri="http://schemas.openxmlformats.org/drawingml/2006/picture">
+                <pic:pic>
+                  <pic:nvPicPr>
+                    <pic:cNvPr id="0" name="image.png"/>
+                    <pic:cNvPicPr/>
+                  </pic:nvPicPr>
+                  <pic:blipFill>
+                    <a:blip r:embed="rId9"/>
+                    <a:stretch>
+                      <a:fillRect/>
+                    </a:stretch>
+                  </pic:blipFill>
+                  <pic:spPr>
+                    <a:xfrm>
+                      <a:off x="0" y="0"/>
+                      <a:ext cx="5669280" cy="995257"/>
+                    </a:xfrm>
+                    <a:prstGeom prst="rect"/>
+                  </pic:spPr>
+                </pic:pic>
+              </a:graphicData>
+            </a:graphic>
+          </wp:inline>
+        </w:drawing>
       </w:r>
     </w:p>
     <w:p>

</xml_diff>